<commit_message>
Removed the Time to information metrice
</commit_message>
<xml_diff>
--- a/ExperimentDetails.docx
+++ b/ExperimentDetails.docx
@@ -49,25 +49,7 @@
           <w:sz w:val="22"/>
           <w:szCs w:val="22"/>
         </w:rPr>
-        <w:t xml:space="preserve">Null Hypothesis: Adding the “summarize” button has no effect on the task success rate </w:t>
-      </w:r>
-      <w:proofErr w:type="spellStart"/>
-      <w:r>
-        <w:rPr>
-          <w:rFonts w:ascii="Calibri" w:hAnsi="Calibri" w:cs="Calibri"/>
-          <w:sz w:val="22"/>
-          <w:szCs w:val="22"/>
-        </w:rPr>
-        <w:t xml:space="preserve">compared </w:t>
-      </w:r>
-      <w:proofErr w:type="spellEnd"/>
-      <w:r>
-        <w:rPr>
-          <w:rFonts w:ascii="Calibri" w:hAnsi="Calibri" w:cs="Calibri"/>
-          <w:sz w:val="22"/>
-          <w:szCs w:val="22"/>
-        </w:rPr>
-        <w:t xml:space="preserve">to the existing layout. </w:t>
+        <w:t xml:space="preserve">Null Hypothesis: Adding the “summarize” button has no effect on the task success rate compared to the existing layout. </w:t>
       </w:r>
     </w:p>
     <w:p>
@@ -649,6 +631,134 @@
         </w:tc>
       </w:tr>
     </w:tbl>
+    <w:p>
+      <w:pPr>
+        <w:rPr>
+          <w:rFonts w:ascii="Calibri" w:hAnsi="Calibri" w:cs="Calibri"/>
+          <w:sz w:val="22"/>
+          <w:szCs w:val="22"/>
+        </w:rPr>
+      </w:pPr>
+    </w:p>
+    <w:p>
+      <w:pPr>
+        <w:rPr>
+          <w:rFonts w:ascii="Calibri" w:hAnsi="Calibri" w:cs="Calibri"/>
+          <w:sz w:val="22"/>
+          <w:szCs w:val="22"/>
+        </w:rPr>
+      </w:pPr>
+      <w:r>
+        <w:rPr>
+          <w:rFonts w:ascii="Calibri" w:hAnsi="Calibri" w:cs="Calibri"/>
+          <w:sz w:val="22"/>
+          <w:szCs w:val="22"/>
+        </w:rPr>
+        <w:t>Metrices</w:t>
+      </w:r>
+    </w:p>
+    <w:p>
+      <w:pPr>
+        <w:rPr>
+          <w:rFonts w:ascii="Calibri" w:hAnsi="Calibri" w:cs="Calibri"/>
+          <w:sz w:val="22"/>
+          <w:szCs w:val="22"/>
+        </w:rPr>
+      </w:pPr>
+      <w:r>
+        <w:rPr>
+          <w:rFonts w:ascii="Calibri" w:hAnsi="Calibri" w:cs="Calibri"/>
+          <w:sz w:val="22"/>
+          <w:szCs w:val="22"/>
+        </w:rPr>
+        <w:t>Primary metrics: Task success rate</w:t>
+      </w:r>
+    </w:p>
+    <w:p>
+      <w:pPr>
+        <w:rPr>
+          <w:rFonts w:ascii="Calibri" w:hAnsi="Calibri" w:cs="Calibri"/>
+          <w:sz w:val="22"/>
+          <w:szCs w:val="22"/>
+        </w:rPr>
+      </w:pPr>
+      <w:r>
+        <w:rPr>
+          <w:rFonts w:ascii="Calibri" w:hAnsi="Calibri" w:cs="Calibri"/>
+          <w:sz w:val="22"/>
+          <w:szCs w:val="22"/>
+        </w:rPr>
+        <w:t xml:space="preserve">% of search session &gt;= 30 seconds or 0 immediate query change. </w:t>
+      </w:r>
+    </w:p>
+    <w:p>
+      <w:pPr>
+        <w:rPr>
+          <w:rFonts w:ascii="Calibri" w:hAnsi="Calibri" w:cs="Calibri"/>
+          <w:sz w:val="22"/>
+          <w:szCs w:val="22"/>
+        </w:rPr>
+      </w:pPr>
+      <w:r>
+        <w:rPr>
+          <w:rFonts w:ascii="Calibri" w:hAnsi="Calibri" w:cs="Calibri"/>
+          <w:sz w:val="22"/>
+          <w:szCs w:val="22"/>
+        </w:rPr>
+        <w:t>Secondary Metrices</w:t>
+      </w:r>
+    </w:p>
+    <w:p>
+      <w:pPr>
+        <w:rPr>
+          <w:rFonts w:ascii="Calibri" w:hAnsi="Calibri" w:cs="Calibri"/>
+          <w:sz w:val="22"/>
+          <w:szCs w:val="22"/>
+        </w:rPr>
+      </w:pPr>
+      <w:r>
+        <w:rPr>
+          <w:rFonts w:ascii="Calibri" w:hAnsi="Calibri" w:cs="Calibri"/>
+          <w:sz w:val="22"/>
+          <w:szCs w:val="22"/>
+        </w:rPr>
+        <w:t>Feature Retention: % of users used the button in week 1 and RETURNED to use it again after 2-4 weeks.</w:t>
+      </w:r>
+    </w:p>
+    <w:p>
+      <w:pPr>
+        <w:rPr>
+          <w:rFonts w:ascii="Calibri" w:hAnsi="Calibri" w:cs="Calibri"/>
+          <w:sz w:val="22"/>
+          <w:szCs w:val="22"/>
+        </w:rPr>
+      </w:pPr>
+      <w:r>
+        <w:rPr>
+          <w:rFonts w:ascii="Calibri" w:hAnsi="Calibri" w:cs="Calibri"/>
+          <w:sz w:val="22"/>
+          <w:szCs w:val="22"/>
+        </w:rPr>
+        <w:t>Latency: how fast the browser responds, (for 95</w:t>
+      </w:r>
+      <w:r>
+        <w:rPr>
+          <w:rFonts w:ascii="Calibri" w:hAnsi="Calibri" w:cs="Calibri"/>
+          <w:sz w:val="22"/>
+          <w:szCs w:val="22"/>
+          <w:vertAlign w:val="superscript"/>
+        </w:rPr>
+        <w:t>th</w:t>
+      </w:r>
+      <w:r>
+        <w:rPr>
+          <w:rFonts w:ascii="Calibri" w:hAnsi="Calibri" w:cs="Calibri"/>
+          <w:sz w:val="22"/>
+          <w:szCs w:val="22"/>
+        </w:rPr>
+        <w:t xml:space="preserve"> percentile) and the rest 5% of users, how much slower did the browser get when adding this button?</w:t>
+      </w:r>
+    </w:p>
     <w:p>
       <w:pPr>
         <w:rPr>

</xml_diff>